<commit_message>
subida de archivos finales
finales
</commit_message>
<xml_diff>
--- a/Documentacion/complicaciones_hospitalarias_proy_dm_f1_e1.docx
+++ b/Documentacion/complicaciones_hospitalarias_proy_dm_f1_e1.docx
@@ -76,120 +76,204 @@
     </w:p>
     <w:p>
       <w:pPr>
-        <w:spacing w:after="60"/>
-        <w:jc w:val="center"/>
-        <w:rPr>
-          <w:lang w:val="es-ES"/>
-        </w:rPr>
-      </w:pPr>
-      <w:r>
-        <w:rPr>
+        <w:spacing w:after="120" w:line="480" w:lineRule="auto"/>
+        <w:rPr>
+          <w:rFonts w:ascii="Arial" w:hAnsi="Arial" w:cs="Arial"/>
+          <w:sz w:val="24"/>
+          <w:szCs w:val="24"/>
+          <w:lang w:val="es-ES"/>
+        </w:rPr>
+      </w:pPr>
+      <w:r>
+        <w:rPr>
+          <w:rFonts w:ascii="Arial" w:hAnsi="Arial" w:cs="Arial"/>
           <w:b/>
           <w:bCs/>
-          <w:sz w:val="22"/>
-          <w:szCs w:val="22"/>
-          <w:lang w:val="es-ES"/>
-        </w:rPr>
-        <w:t>Integrantes:</w:t>
+          <w:sz w:val="24"/>
+          <w:szCs w:val="24"/>
+          <w:lang w:val="es-ES"/>
+        </w:rPr>
+        <w:t xml:space="preserve">Integrantes: </w:t>
+      </w:r>
+      <w:r>
+        <w:rPr>
+          <w:rFonts w:ascii="Arial" w:hAnsi="Arial" w:cs="Arial"/>
+          <w:sz w:val="24"/>
+          <w:szCs w:val="24"/>
+          <w:lang w:val="es-ES"/>
+        </w:rPr>
+        <w:t>Alejandro Cesar Acho Huallpa (Estratega)</w:t>
       </w:r>
     </w:p>
     <w:p>
       <w:pPr>
-        <w:spacing w:after="20"/>
-        <w:jc w:val="center"/>
-        <w:rPr>
-          <w:lang w:val="es-ES"/>
-        </w:rPr>
-      </w:pPr>
-      <w:r>
-        <w:rPr>
-          <w:sz w:val="22"/>
-          <w:szCs w:val="22"/>
-          <w:lang w:val="es-ES"/>
-        </w:rPr>
-        <w:t>[Nombre Apellido 1]</w:t>
+        <w:spacing w:after="120" w:line="480" w:lineRule="auto"/>
+        <w:rPr>
+          <w:rFonts w:ascii="Arial" w:hAnsi="Arial" w:cs="Arial"/>
+          <w:sz w:val="24"/>
+          <w:szCs w:val="24"/>
+          <w:lang w:val="es-ES"/>
+        </w:rPr>
+      </w:pPr>
+      <w:r>
+        <w:rPr>
+          <w:rFonts w:ascii="Arial" w:hAnsi="Arial" w:cs="Arial"/>
+          <w:sz w:val="24"/>
+          <w:szCs w:val="24"/>
+          <w:lang w:val="es-ES"/>
+        </w:rPr>
+        <w:t xml:space="preserve">Shaden </w:t>
+      </w:r>
+      <w:proofErr w:type="spellStart"/>
+      <w:r>
+        <w:rPr>
+          <w:rFonts w:ascii="Arial" w:hAnsi="Arial" w:cs="Arial"/>
+          <w:sz w:val="24"/>
+          <w:szCs w:val="24"/>
+          <w:lang w:val="es-ES"/>
+        </w:rPr>
+        <w:t>Ahira</w:t>
+      </w:r>
+      <w:proofErr w:type="spellEnd"/>
+      <w:r>
+        <w:rPr>
+          <w:rFonts w:ascii="Arial" w:hAnsi="Arial" w:cs="Arial"/>
+          <w:sz w:val="24"/>
+          <w:szCs w:val="24"/>
+          <w:lang w:val="es-ES"/>
+        </w:rPr>
+        <w:t xml:space="preserve"> Cruz Condori (</w:t>
+      </w:r>
+      <w:proofErr w:type="spellStart"/>
+      <w:r>
+        <w:rPr>
+          <w:rFonts w:ascii="Arial" w:hAnsi="Arial" w:cs="Arial"/>
+          <w:sz w:val="24"/>
+          <w:szCs w:val="24"/>
+          <w:lang w:val="es-ES"/>
+        </w:rPr>
+        <w:t>StoryTeller</w:t>
+      </w:r>
+      <w:proofErr w:type="spellEnd"/>
+      <w:r>
+        <w:rPr>
+          <w:rFonts w:ascii="Arial" w:hAnsi="Arial" w:cs="Arial"/>
+          <w:sz w:val="24"/>
+          <w:szCs w:val="24"/>
+          <w:lang w:val="es-ES"/>
+        </w:rPr>
+        <w:t>)</w:t>
       </w:r>
     </w:p>
     <w:p>
       <w:pPr>
-        <w:spacing w:after="20"/>
-        <w:jc w:val="center"/>
-        <w:rPr>
-          <w:lang w:val="es-ES"/>
-        </w:rPr>
-      </w:pPr>
-      <w:r>
-        <w:rPr>
-          <w:sz w:val="22"/>
-          <w:szCs w:val="22"/>
-          <w:lang w:val="es-ES"/>
-        </w:rPr>
-        <w:t>[Nombre Apellido 2]</w:t>
+        <w:spacing w:after="120" w:line="480" w:lineRule="auto"/>
+        <w:rPr>
+          <w:rFonts w:ascii="Arial" w:hAnsi="Arial" w:cs="Arial"/>
+          <w:sz w:val="24"/>
+          <w:szCs w:val="24"/>
+          <w:lang w:val="es-ES"/>
+        </w:rPr>
+      </w:pPr>
+      <w:r>
+        <w:rPr>
+          <w:rFonts w:ascii="Arial" w:hAnsi="Arial" w:cs="Arial"/>
+          <w:sz w:val="24"/>
+          <w:szCs w:val="24"/>
+          <w:lang w:val="es-ES"/>
+        </w:rPr>
+        <w:t xml:space="preserve">Jorge Armando Coquendo Amba (Estratega) </w:t>
       </w:r>
     </w:p>
     <w:p>
       <w:pPr>
-        <w:spacing w:after="20"/>
-        <w:jc w:val="center"/>
-        <w:rPr>
-          <w:lang w:val="es-ES"/>
-        </w:rPr>
-      </w:pPr>
-      <w:r>
-        <w:rPr>
-          <w:sz w:val="22"/>
-          <w:szCs w:val="22"/>
-          <w:lang w:val="es-ES"/>
-        </w:rPr>
-        <w:t>[Nombre Apellido 3]</w:t>
+        <w:spacing w:after="120" w:line="480" w:lineRule="auto"/>
+        <w:rPr>
+          <w:rFonts w:ascii="Arial" w:hAnsi="Arial" w:cs="Arial"/>
+          <w:sz w:val="24"/>
+          <w:szCs w:val="24"/>
+          <w:lang w:val="es-ES"/>
+        </w:rPr>
+      </w:pPr>
+      <w:proofErr w:type="spellStart"/>
+      <w:r>
+        <w:rPr>
+          <w:rFonts w:ascii="Arial" w:hAnsi="Arial" w:cs="Arial"/>
+          <w:sz w:val="24"/>
+          <w:szCs w:val="24"/>
+          <w:lang w:val="es-ES"/>
+        </w:rPr>
+        <w:t>Jose</w:t>
+      </w:r>
+      <w:proofErr w:type="spellEnd"/>
+      <w:r>
+        <w:rPr>
+          <w:rFonts w:ascii="Arial" w:hAnsi="Arial" w:cs="Arial"/>
+          <w:sz w:val="24"/>
+          <w:szCs w:val="24"/>
+          <w:lang w:val="es-ES"/>
+        </w:rPr>
+        <w:t xml:space="preserve"> </w:t>
+      </w:r>
+      <w:proofErr w:type="spellStart"/>
+      <w:r>
+        <w:rPr>
+          <w:rFonts w:ascii="Arial" w:hAnsi="Arial" w:cs="Arial"/>
+          <w:sz w:val="24"/>
+          <w:szCs w:val="24"/>
+          <w:lang w:val="es-ES"/>
+        </w:rPr>
+        <w:t>Angel</w:t>
+      </w:r>
+      <w:proofErr w:type="spellEnd"/>
+      <w:r>
+        <w:rPr>
+          <w:rFonts w:ascii="Arial" w:hAnsi="Arial" w:cs="Arial"/>
+          <w:sz w:val="24"/>
+          <w:szCs w:val="24"/>
+          <w:lang w:val="es-ES"/>
+        </w:rPr>
+        <w:t xml:space="preserve"> Mamani Escarzo (Arquitecto de Software) </w:t>
       </w:r>
     </w:p>
     <w:p>
       <w:pPr>
-        <w:spacing w:before="700"/>
-        <w:rPr>
-          <w:lang w:val="es-ES"/>
-        </w:rPr>
-      </w:pPr>
+        <w:spacing w:after="120" w:line="480" w:lineRule="auto"/>
+        <w:rPr>
+          <w:rFonts w:ascii="Arial" w:hAnsi="Arial" w:cs="Arial"/>
+          <w:sz w:val="24"/>
+          <w:szCs w:val="24"/>
+          <w:lang w:val="es-ES"/>
+        </w:rPr>
+      </w:pPr>
+      <w:r>
+        <w:rPr>
+          <w:rFonts w:ascii="Arial" w:hAnsi="Arial" w:cs="Arial"/>
+          <w:sz w:val="24"/>
+          <w:szCs w:val="24"/>
+          <w:lang w:val="es-ES"/>
+        </w:rPr>
+        <w:t>Jhonatan Oraqueni Condori (Analista)</w:t>
+      </w:r>
     </w:p>
     <w:p>
       <w:pPr>
-        <w:jc w:val="center"/>
-        <w:rPr>
-          <w:lang w:val="es-ES"/>
-        </w:rPr>
-      </w:pPr>
-      <w:r>
-        <w:rPr>
-          <w:color w:val="595959"/>
-          <w:lang w:val="es-ES"/>
-        </w:rPr>
-        <w:t>Fuente de datos: base_de_datos_medicina_complicaciones_modificada.xlsx</w:t>
-      </w:r>
-    </w:p>
-    <w:p>
-      <w:pPr>
-        <w:jc w:val="center"/>
-        <w:rPr>
-          <w:lang w:val="es-ES"/>
-        </w:rPr>
-      </w:pPr>
-      <w:r>
-        <w:rPr>
-          <w:color w:val="595959"/>
-          <w:lang w:val="es-ES"/>
-        </w:rPr>
-        <w:t>Septiembre 2026</w:t>
-      </w:r>
-    </w:p>
-    <w:p>
-      <w:pPr>
-        <w:rPr>
-          <w:lang w:val="es-ES"/>
-        </w:rPr>
-      </w:pPr>
-      <w:r>
-        <w:rPr>
+        <w:rPr>
+          <w:rFonts w:ascii="Arial" w:hAnsi="Arial" w:cs="Arial"/>
+          <w:b/>
+          <w:bCs/>
+          <w:sz w:val="24"/>
+          <w:szCs w:val="24"/>
+          <w:lang w:val="es-ES"/>
+        </w:rPr>
+      </w:pPr>
+      <w:r>
+        <w:rPr>
+          <w:rFonts w:ascii="Arial" w:hAnsi="Arial" w:cs="Arial"/>
+          <w:b/>
+          <w:bCs/>
+          <w:sz w:val="24"/>
+          <w:szCs w:val="24"/>
           <w:lang w:val="es-ES"/>
         </w:rPr>
         <w:br w:type="page"/>
@@ -440,12 +524,6 @@
         <w:gridCol w:w="7904"/>
       </w:tblGrid>
       <w:tr>
-        <w:tblPrEx>
-          <w:tblCellMar>
-            <w:top w:w="0" w:type="dxa"/>
-            <w:bottom w:w="0" w:type="dxa"/>
-          </w:tblCellMar>
-        </w:tblPrEx>
         <w:tc>
           <w:tcPr>
             <w:tcW w:w="0" w:type="auto"/>
@@ -529,12 +607,6 @@
         </w:tc>
       </w:tr>
       <w:tr>
-        <w:tblPrEx>
-          <w:tblCellMar>
-            <w:top w:w="0" w:type="dxa"/>
-            <w:bottom w:w="0" w:type="dxa"/>
-          </w:tblCellMar>
-        </w:tblPrEx>
         <w:tc>
           <w:tcPr>
             <w:tcW w:w="0" w:type="auto"/>
@@ -624,12 +696,6 @@
         </w:tc>
       </w:tr>
       <w:tr>
-        <w:tblPrEx>
-          <w:tblCellMar>
-            <w:top w:w="0" w:type="dxa"/>
-            <w:bottom w:w="0" w:type="dxa"/>
-          </w:tblCellMar>
-        </w:tblPrEx>
         <w:tc>
           <w:tcPr>
             <w:tcW w:w="0" w:type="auto"/>
@@ -729,12 +795,6 @@
         </w:tc>
       </w:tr>
       <w:tr>
-        <w:tblPrEx>
-          <w:tblCellMar>
-            <w:top w:w="0" w:type="dxa"/>
-            <w:bottom w:w="0" w:type="dxa"/>
-          </w:tblCellMar>
-        </w:tblPrEx>
         <w:tc>
           <w:tcPr>
             <w:tcW w:w="0" w:type="auto"/>
@@ -808,12 +868,6 @@
         </w:tc>
       </w:tr>
       <w:tr>
-        <w:tblPrEx>
-          <w:tblCellMar>
-            <w:top w:w="0" w:type="dxa"/>
-            <w:bottom w:w="0" w:type="dxa"/>
-          </w:tblCellMar>
-        </w:tblPrEx>
         <w:tc>
           <w:tcPr>
             <w:tcW w:w="0" w:type="auto"/>
@@ -1022,12 +1076,6 @@
         <w:gridCol w:w="4638"/>
       </w:tblGrid>
       <w:tr>
-        <w:tblPrEx>
-          <w:tblCellMar>
-            <w:top w:w="0" w:type="dxa"/>
-            <w:bottom w:w="0" w:type="dxa"/>
-          </w:tblCellMar>
-        </w:tblPrEx>
         <w:trPr>
           <w:tblHeader/>
         </w:trPr>
@@ -1099,12 +1147,6 @@
         </w:tc>
       </w:tr>
       <w:tr>
-        <w:tblPrEx>
-          <w:tblCellMar>
-            <w:top w:w="0" w:type="dxa"/>
-            <w:bottom w:w="0" w:type="dxa"/>
-          </w:tblCellMar>
-        </w:tblPrEx>
         <w:tc>
           <w:tcPr>
             <w:tcW w:w="5000" w:type="dxa"/>
@@ -1175,12 +1217,6 @@
         </w:tc>
       </w:tr>
       <w:tr>
-        <w:tblPrEx>
-          <w:tblCellMar>
-            <w:top w:w="0" w:type="dxa"/>
-            <w:bottom w:w="0" w:type="dxa"/>
-          </w:tblCellMar>
-        </w:tblPrEx>
         <w:tc>
           <w:tcPr>
             <w:tcW w:w="5000" w:type="dxa"/>
@@ -1279,12 +1315,6 @@
         </w:tc>
       </w:tr>
       <w:tr>
-        <w:tblPrEx>
-          <w:tblCellMar>
-            <w:top w:w="0" w:type="dxa"/>
-            <w:bottom w:w="0" w:type="dxa"/>
-          </w:tblCellMar>
-        </w:tblPrEx>
         <w:tc>
           <w:tcPr>
             <w:tcW w:w="5000" w:type="dxa"/>
@@ -1365,12 +1395,6 @@
         </w:tc>
       </w:tr>
       <w:tr>
-        <w:tblPrEx>
-          <w:tblCellMar>
-            <w:top w:w="0" w:type="dxa"/>
-            <w:bottom w:w="0" w:type="dxa"/>
-          </w:tblCellMar>
-        </w:tblPrEx>
         <w:tc>
           <w:tcPr>
             <w:tcW w:w="5000" w:type="dxa"/>
@@ -1730,12 +1754,6 @@
         <w:gridCol w:w="5638"/>
       </w:tblGrid>
       <w:tr>
-        <w:tblPrEx>
-          <w:tblCellMar>
-            <w:top w:w="0" w:type="dxa"/>
-            <w:bottom w:w="0" w:type="dxa"/>
-          </w:tblCellMar>
-        </w:tblPrEx>
         <w:trPr>
           <w:tblHeader/>
         </w:trPr>
@@ -1807,12 +1825,6 @@
         </w:tc>
       </w:tr>
       <w:tr>
-        <w:tblPrEx>
-          <w:tblCellMar>
-            <w:top w:w="0" w:type="dxa"/>
-            <w:bottom w:w="0" w:type="dxa"/>
-          </w:tblCellMar>
-        </w:tblPrEx>
         <w:tc>
           <w:tcPr>
             <w:tcW w:w="4000" w:type="dxa"/>
@@ -1893,12 +1905,6 @@
         </w:tc>
       </w:tr>
       <w:tr>
-        <w:tblPrEx>
-          <w:tblCellMar>
-            <w:top w:w="0" w:type="dxa"/>
-            <w:bottom w:w="0" w:type="dxa"/>
-          </w:tblCellMar>
-        </w:tblPrEx>
         <w:tc>
           <w:tcPr>
             <w:tcW w:w="4000" w:type="dxa"/>
@@ -1969,12 +1975,6 @@
         </w:tc>
       </w:tr>
       <w:tr>
-        <w:tblPrEx>
-          <w:tblCellMar>
-            <w:top w:w="0" w:type="dxa"/>
-            <w:bottom w:w="0" w:type="dxa"/>
-          </w:tblCellMar>
-        </w:tblPrEx>
         <w:tc>
           <w:tcPr>
             <w:tcW w:w="4000" w:type="dxa"/>
@@ -2047,12 +2047,6 @@
         </w:tc>
       </w:tr>
       <w:tr>
-        <w:tblPrEx>
-          <w:tblCellMar>
-            <w:top w:w="0" w:type="dxa"/>
-            <w:bottom w:w="0" w:type="dxa"/>
-          </w:tblCellMar>
-        </w:tblPrEx>
         <w:tc>
           <w:tcPr>
             <w:tcW w:w="4000" w:type="dxa"/>
@@ -2259,12 +2253,6 @@
         <w:gridCol w:w="2638"/>
       </w:tblGrid>
       <w:tr>
-        <w:tblPrEx>
-          <w:tblCellMar>
-            <w:top w:w="0" w:type="dxa"/>
-            <w:bottom w:w="0" w:type="dxa"/>
-          </w:tblCellMar>
-        </w:tblPrEx>
         <w:trPr>
           <w:tblHeader/>
         </w:trPr>
@@ -2390,12 +2378,6 @@
         </w:tc>
       </w:tr>
       <w:tr>
-        <w:tblPrEx>
-          <w:tblCellMar>
-            <w:top w:w="0" w:type="dxa"/>
-            <w:bottom w:w="0" w:type="dxa"/>
-          </w:tblCellMar>
-        </w:tblPrEx>
         <w:tc>
           <w:tcPr>
             <w:tcW w:w="4000" w:type="dxa"/>
@@ -2702,12 +2684,6 @@
         <w:gridCol w:w="3238"/>
       </w:tblGrid>
       <w:tr>
-        <w:tblPrEx>
-          <w:tblCellMar>
-            <w:top w:w="0" w:type="dxa"/>
-            <w:bottom w:w="0" w:type="dxa"/>
-          </w:tblCellMar>
-        </w:tblPrEx>
         <w:trPr>
           <w:tblHeader/>
         </w:trPr>
@@ -2877,12 +2853,6 @@
         </w:tc>
       </w:tr>
       <w:tr>
-        <w:tblPrEx>
-          <w:tblCellMar>
-            <w:top w:w="0" w:type="dxa"/>
-            <w:bottom w:w="0" w:type="dxa"/>
-          </w:tblCellMar>
-        </w:tblPrEx>
         <w:tc>
           <w:tcPr>
             <w:tcW w:w="3200" w:type="dxa"/>
@@ -2972,12 +2942,6 @@
         </w:tc>
       </w:tr>
       <w:tr>
-        <w:tblPrEx>
-          <w:tblCellMar>
-            <w:top w:w="0" w:type="dxa"/>
-            <w:bottom w:w="0" w:type="dxa"/>
-          </w:tblCellMar>
-        </w:tblPrEx>
         <w:tc>
           <w:tcPr>
             <w:tcW w:w="3200" w:type="dxa"/>
@@ -3067,12 +3031,6 @@
         </w:tc>
       </w:tr>
       <w:tr>
-        <w:tblPrEx>
-          <w:tblCellMar>
-            <w:top w:w="0" w:type="dxa"/>
-            <w:bottom w:w="0" w:type="dxa"/>
-          </w:tblCellMar>
-        </w:tblPrEx>
         <w:tc>
           <w:tcPr>
             <w:tcW w:w="3200" w:type="dxa"/>
@@ -3451,12 +3409,6 @@
         <w:gridCol w:w="4838"/>
       </w:tblGrid>
       <w:tr>
-        <w:tblPrEx>
-          <w:tblCellMar>
-            <w:top w:w="0" w:type="dxa"/>
-            <w:bottom w:w="0" w:type="dxa"/>
-          </w:tblCellMar>
-        </w:tblPrEx>
         <w:trPr>
           <w:tblHeader/>
         </w:trPr>
@@ -3538,12 +3490,6 @@
         </w:tc>
       </w:tr>
       <w:tr>
-        <w:tblPrEx>
-          <w:tblCellMar>
-            <w:top w:w="0" w:type="dxa"/>
-            <w:bottom w:w="0" w:type="dxa"/>
-          </w:tblCellMar>
-        </w:tblPrEx>
         <w:tc>
           <w:tcPr>
             <w:tcW w:w="4800" w:type="dxa"/>
@@ -3614,12 +3560,6 @@
         </w:tc>
       </w:tr>
       <w:tr>
-        <w:tblPrEx>
-          <w:tblCellMar>
-            <w:top w:w="0" w:type="dxa"/>
-            <w:bottom w:w="0" w:type="dxa"/>
-          </w:tblCellMar>
-        </w:tblPrEx>
         <w:tc>
           <w:tcPr>
             <w:tcW w:w="4800" w:type="dxa"/>
@@ -3690,12 +3630,6 @@
         </w:tc>
       </w:tr>
       <w:tr>
-        <w:tblPrEx>
-          <w:tblCellMar>
-            <w:top w:w="0" w:type="dxa"/>
-            <w:bottom w:w="0" w:type="dxa"/>
-          </w:tblCellMar>
-        </w:tblPrEx>
         <w:trPr>
           <w:tblHeader/>
         </w:trPr>
@@ -3779,12 +3713,6 @@
         </w:tc>
       </w:tr>
       <w:tr>
-        <w:tblPrEx>
-          <w:tblCellMar>
-            <w:top w:w="0" w:type="dxa"/>
-            <w:bottom w:w="0" w:type="dxa"/>
-          </w:tblCellMar>
-        </w:tblPrEx>
         <w:tc>
           <w:tcPr>
             <w:tcW w:w="4800" w:type="dxa"/>
@@ -3845,12 +3773,6 @@
         </w:tc>
       </w:tr>
       <w:tr>
-        <w:tblPrEx>
-          <w:tblCellMar>
-            <w:top w:w="0" w:type="dxa"/>
-            <w:bottom w:w="0" w:type="dxa"/>
-          </w:tblCellMar>
-        </w:tblPrEx>
         <w:tc>
           <w:tcPr>
             <w:tcW w:w="4800" w:type="dxa"/>
@@ -3914,12 +3836,6 @@
         </w:tc>
       </w:tr>
       <w:tr>
-        <w:tblPrEx>
-          <w:tblCellMar>
-            <w:top w:w="0" w:type="dxa"/>
-            <w:bottom w:w="0" w:type="dxa"/>
-          </w:tblCellMar>
-        </w:tblPrEx>
         <w:tc>
           <w:tcPr>
             <w:tcW w:w="4800" w:type="dxa"/>
@@ -3982,12 +3898,6 @@
         </w:tc>
       </w:tr>
       <w:tr>
-        <w:tblPrEx>
-          <w:tblCellMar>
-            <w:top w:w="0" w:type="dxa"/>
-            <w:bottom w:w="0" w:type="dxa"/>
-          </w:tblCellMar>
-        </w:tblPrEx>
         <w:tc>
           <w:tcPr>
             <w:tcW w:w="4800" w:type="dxa"/>
@@ -4068,12 +3978,6 @@
         </w:tc>
       </w:tr>
       <w:tr>
-        <w:tblPrEx>
-          <w:tblCellMar>
-            <w:top w:w="0" w:type="dxa"/>
-            <w:bottom w:w="0" w:type="dxa"/>
-          </w:tblCellMar>
-        </w:tblPrEx>
         <w:tc>
           <w:tcPr>
             <w:tcW w:w="4800" w:type="dxa"/>
@@ -4144,12 +4048,6 @@
         </w:tc>
       </w:tr>
       <w:tr>
-        <w:tblPrEx>
-          <w:tblCellMar>
-            <w:top w:w="0" w:type="dxa"/>
-            <w:bottom w:w="0" w:type="dxa"/>
-          </w:tblCellMar>
-        </w:tblPrEx>
         <w:tc>
           <w:tcPr>
             <w:tcW w:w="4800" w:type="dxa"/>
@@ -4384,12 +4282,6 @@
         <w:gridCol w:w="4838"/>
       </w:tblGrid>
       <w:tr>
-        <w:tblPrEx>
-          <w:tblCellMar>
-            <w:top w:w="0" w:type="dxa"/>
-            <w:bottom w:w="0" w:type="dxa"/>
-          </w:tblCellMar>
-        </w:tblPrEx>
         <w:trPr>
           <w:tblHeader/>
         </w:trPr>
@@ -4473,12 +4365,6 @@
         </w:tc>
       </w:tr>
       <w:tr>
-        <w:tblPrEx>
-          <w:tblCellMar>
-            <w:top w:w="0" w:type="dxa"/>
-            <w:bottom w:w="0" w:type="dxa"/>
-          </w:tblCellMar>
-        </w:tblPrEx>
         <w:tc>
           <w:tcPr>
             <w:tcW w:w="4800" w:type="dxa"/>
@@ -4541,12 +4427,6 @@
         </w:tc>
       </w:tr>
       <w:tr>
-        <w:tblPrEx>
-          <w:tblCellMar>
-            <w:top w:w="0" w:type="dxa"/>
-            <w:bottom w:w="0" w:type="dxa"/>
-          </w:tblCellMar>
-        </w:tblPrEx>
         <w:tc>
           <w:tcPr>
             <w:tcW w:w="4800" w:type="dxa"/>
@@ -4617,12 +4497,6 @@
         </w:tc>
       </w:tr>
       <w:tr>
-        <w:tblPrEx>
-          <w:tblCellMar>
-            <w:top w:w="0" w:type="dxa"/>
-            <w:bottom w:w="0" w:type="dxa"/>
-          </w:tblCellMar>
-        </w:tblPrEx>
         <w:tc>
           <w:tcPr>
             <w:tcW w:w="4800" w:type="dxa"/>
@@ -4684,12 +4558,6 @@
         </w:tc>
       </w:tr>
       <w:tr>
-        <w:tblPrEx>
-          <w:tblCellMar>
-            <w:top w:w="0" w:type="dxa"/>
-            <w:bottom w:w="0" w:type="dxa"/>
-          </w:tblCellMar>
-        </w:tblPrEx>
         <w:tc>
           <w:tcPr>
             <w:tcW w:w="4800" w:type="dxa"/>
@@ -4760,12 +4628,6 @@
         </w:tc>
       </w:tr>
       <w:tr>
-        <w:tblPrEx>
-          <w:tblCellMar>
-            <w:top w:w="0" w:type="dxa"/>
-            <w:bottom w:w="0" w:type="dxa"/>
-          </w:tblCellMar>
-        </w:tblPrEx>
         <w:tc>
           <w:tcPr>
             <w:tcW w:w="4800" w:type="dxa"/>
@@ -4828,12 +4690,6 @@
         </w:tc>
       </w:tr>
       <w:tr>
-        <w:tblPrEx>
-          <w:tblCellMar>
-            <w:top w:w="0" w:type="dxa"/>
-            <w:bottom w:w="0" w:type="dxa"/>
-          </w:tblCellMar>
-        </w:tblPrEx>
         <w:tc>
           <w:tcPr>
             <w:tcW w:w="4800" w:type="dxa"/>
@@ -4896,12 +4752,6 @@
         </w:tc>
       </w:tr>
       <w:tr>
-        <w:tblPrEx>
-          <w:tblCellMar>
-            <w:top w:w="0" w:type="dxa"/>
-            <w:bottom w:w="0" w:type="dxa"/>
-          </w:tblCellMar>
-        </w:tblPrEx>
         <w:tc>
           <w:tcPr>
             <w:tcW w:w="4800" w:type="dxa"/>

</xml_diff>